<commit_message>
add message notifications and item context
</commit_message>
<xml_diff>
--- a/mamaketplace notes.docx
+++ b/mamaketplace notes.docx
@@ -84,6 +84,7 @@
         <w:rPr>
           <w:b/>
           <w:bCs/>
+          <w:noProof/>
         </w:rPr>
         <mc:AlternateContent>
           <mc:Choice Requires="wps">
@@ -274,10 +275,7 @@
     <w:p>
       <w:proofErr w:type="spellStart"/>
       <w:r>
-        <w:t>V</w:t>
-      </w:r>
-      <w:r>
-        <w:t>bjosjlknavqpvkjkyyg</w:t>
+        <w:t>Vbjosjlknavqpvkjkyyg</w:t>
       </w:r>
       <w:proofErr w:type="spellEnd"/>
     </w:p>
@@ -289,6 +287,9 @@
     </w:p>
     <w:p>
       <w:r>
+        <w:rPr>
+          <w:noProof/>
+        </w:rPr>
         <mc:AlternateContent>
           <mc:Choice Requires="wps">
             <w:drawing>
@@ -359,6 +360,9 @@
     </w:p>
     <w:p>
       <w:r>
+        <w:rPr>
+          <w:noProof/>
+        </w:rPr>
         <w:lastRenderedPageBreak/>
         <mc:AlternateContent>
           <mc:Choice Requires="wps">
@@ -439,6 +443,7 @@
         <w:rPr>
           <w:b/>
           <w:bCs/>
+          <w:noProof/>
         </w:rPr>
         <mc:AlternateContent>
           <mc:Choice Requires="wps">
@@ -512,17 +517,8 @@
           <w:b/>
           <w:bCs/>
         </w:rPr>
-        <w:t xml:space="preserve"> Our </w:t>
-      </w:r>
-      <w:proofErr w:type="gramStart"/>
-      <w:r>
-        <w:rPr>
-          <w:b/>
-          <w:bCs/>
-        </w:rPr>
-        <w:t>Community</w:t>
-      </w:r>
-      <w:proofErr w:type="gramEnd"/>
+        <w:t> Our Community</w:t>
+      </w:r>
     </w:p>
     <w:p>
       <w:proofErr w:type="spellStart"/>
@@ -591,6 +587,9 @@
         <w:t>Thank you for being part of something meaningful. </w:t>
       </w:r>
       <w:r>
+        <w:rPr>
+          <w:noProof/>
+        </w:rPr>
         <mc:AlternateContent>
           <mc:Choice Requires="wps">
             <w:drawing>
@@ -659,6 +658,402 @@
         </mc:AlternateContent>
       </w:r>
     </w:p>
+    <w:p>
+      <w:proofErr w:type="spellStart"/>
+      <w:r>
+        <w:rPr>
+          <w:b/>
+          <w:bCs/>
+        </w:rPr>
+        <w:lastRenderedPageBreak/>
+        <w:t>Mamaketplace</w:t>
+      </w:r>
+      <w:proofErr w:type="spellEnd"/>
+      <w:r>
+        <w:rPr>
+          <w:b/>
+          <w:bCs/>
+        </w:rPr>
+        <w:t xml:space="preserve"> — Project Status</w:t>
+      </w:r>
+    </w:p>
+    <w:p>
+      <w:r>
+        <w:rPr>
+          <w:b/>
+          <w:bCs/>
+        </w:rPr>
+        <w:t>App URL:</w:t>
+      </w:r>
+      <w:r>
+        <w:t xml:space="preserve"> </w:t>
+      </w:r>
+      <w:hyperlink r:id="rId5" w:history="1">
+        <w:r>
+          <w:rPr>
+            <w:rStyle w:val="Hyperlink"/>
+          </w:rPr>
+          <w:t>https://mamaketplace.vercel.app</w:t>
+        </w:r>
+      </w:hyperlink>
+    </w:p>
+    <w:p>
+      <w:r>
+        <w:rPr>
+          <w:b/>
+          <w:bCs/>
+        </w:rPr>
+        <w:t>GitHub:</w:t>
+      </w:r>
+      <w:r>
+        <w:t xml:space="preserve"> </w:t>
+      </w:r>
+      <w:hyperlink r:id="rId6" w:history="1">
+        <w:r>
+          <w:rPr>
+            <w:rStyle w:val="Hyperlink"/>
+          </w:rPr>
+          <w:t>https://github.com/ksycheng/mamaketplace</w:t>
+        </w:r>
+      </w:hyperlink>
+    </w:p>
+    <w:p>
+      <w:r>
+        <w:rPr>
+          <w:b/>
+          <w:bCs/>
+        </w:rPr>
+        <w:t>Local folder:</w:t>
+      </w:r>
+      <w:r>
+        <w:t xml:space="preserve"> C:\Users\ksych\OneDrive\Desktop\mamaketplace</w:t>
+      </w:r>
+    </w:p>
+    <w:p>
+      <w:r>
+        <w:rPr>
+          <w:b/>
+          <w:bCs/>
+        </w:rPr>
+        <w:t>Tech stack:</w:t>
+      </w:r>
+      <w:r>
+        <w:t xml:space="preserve"> React + Vite, </w:t>
+      </w:r>
+      <w:proofErr w:type="spellStart"/>
+      <w:r>
+        <w:t>Supabase</w:t>
+      </w:r>
+      <w:proofErr w:type="spellEnd"/>
+      <w:r>
+        <w:t xml:space="preserve">, deployed on </w:t>
+      </w:r>
+      <w:proofErr w:type="spellStart"/>
+      <w:r>
+        <w:t>Vercel</w:t>
+      </w:r>
+      <w:proofErr w:type="spellEnd"/>
+      <w:r>
+        <w:t xml:space="preserve"> (master branch → Production)</w:t>
+      </w:r>
+    </w:p>
+    <w:p>
+      <w:proofErr w:type="spellStart"/>
+      <w:r>
+        <w:rPr>
+          <w:b/>
+          <w:bCs/>
+        </w:rPr>
+        <w:t>Supabase</w:t>
+      </w:r>
+      <w:proofErr w:type="spellEnd"/>
+      <w:r>
+        <w:rPr>
+          <w:b/>
+          <w:bCs/>
+        </w:rPr>
+        <w:t xml:space="preserve"> project:</w:t>
+      </w:r>
+      <w:r>
+        <w:t xml:space="preserve"> </w:t>
+      </w:r>
+      <w:hyperlink r:id="rId7" w:history="1">
+        <w:r>
+          <w:rPr>
+            <w:rStyle w:val="Hyperlink"/>
+          </w:rPr>
+          <w:t>https://vbjosjlknavqpvkjkyyg.supabase.co</w:t>
+        </w:r>
+      </w:hyperlink>
+    </w:p>
+    <w:p>
+      <w:r>
+        <w:rPr>
+          <w:b/>
+          <w:bCs/>
+        </w:rPr>
+        <w:t>What's built:</w:t>
+      </w:r>
+    </w:p>
+    <w:p>
+      <w:pPr>
+        <w:numPr>
+          <w:ilvl w:val="0"/>
+          <w:numId w:val="1"/>
+        </w:numPr>
+      </w:pPr>
+      <w:r>
+        <w:rPr>
+          <w:rFonts w:ascii="Segoe UI Emoji" w:hAnsi="Segoe UI Emoji" w:cs="Segoe UI Emoji"/>
+        </w:rPr>
+        <w:t>✅</w:t>
+      </w:r>
+      <w:r>
+        <w:t xml:space="preserve"> Homepage with logo, categories, search</w:t>
+      </w:r>
+    </w:p>
+    <w:p>
+      <w:pPr>
+        <w:numPr>
+          <w:ilvl w:val="0"/>
+          <w:numId w:val="1"/>
+        </w:numPr>
+      </w:pPr>
+      <w:r>
+        <w:rPr>
+          <w:rFonts w:ascii="Segoe UI Emoji" w:hAnsi="Segoe UI Emoji" w:cs="Segoe UI Emoji"/>
+        </w:rPr>
+        <w:t>✅</w:t>
+      </w:r>
+      <w:r>
+        <w:t xml:space="preserve"> Sign up / Sign in with welcome toast</w:t>
+      </w:r>
+    </w:p>
+    <w:p>
+      <w:pPr>
+        <w:numPr>
+          <w:ilvl w:val="0"/>
+          <w:numId w:val="1"/>
+        </w:numPr>
+      </w:pPr>
+      <w:r>
+        <w:rPr>
+          <w:rFonts w:ascii="Segoe UI Emoji" w:hAnsi="Segoe UI Emoji" w:cs="Segoe UI Emoji"/>
+        </w:rPr>
+        <w:t>✅</w:t>
+      </w:r>
+      <w:r>
+        <w:t xml:space="preserve"> Post listings (sell, trade, free) with photo upload</w:t>
+      </w:r>
+    </w:p>
+    <w:p>
+      <w:pPr>
+        <w:numPr>
+          <w:ilvl w:val="0"/>
+          <w:numId w:val="1"/>
+        </w:numPr>
+      </w:pPr>
+      <w:r>
+        <w:rPr>
+          <w:rFonts w:ascii="Segoe UI Emoji" w:hAnsi="Segoe UI Emoji" w:cs="Segoe UI Emoji"/>
+        </w:rPr>
+        <w:t>✅</w:t>
+      </w:r>
+      <w:r>
+        <w:t xml:space="preserve"> Edit and delete own listings</w:t>
+      </w:r>
+    </w:p>
+    <w:p>
+      <w:pPr>
+        <w:numPr>
+          <w:ilvl w:val="0"/>
+          <w:numId w:val="1"/>
+        </w:numPr>
+      </w:pPr>
+      <w:r>
+        <w:rPr>
+          <w:rFonts w:ascii="Segoe UI Emoji" w:hAnsi="Segoe UI Emoji" w:cs="Segoe UI Emoji"/>
+        </w:rPr>
+        <w:t>✅</w:t>
+      </w:r>
+      <w:r>
+        <w:t xml:space="preserve"> Messaging between buyers and sellers</w:t>
+      </w:r>
+    </w:p>
+    <w:p>
+      <w:pPr>
+        <w:numPr>
+          <w:ilvl w:val="0"/>
+          <w:numId w:val="1"/>
+        </w:numPr>
+      </w:pPr>
+      <w:r>
+        <w:rPr>
+          <w:rFonts w:ascii="Segoe UI Emoji" w:hAnsi="Segoe UI Emoji" w:cs="Segoe UI Emoji"/>
+        </w:rPr>
+        <w:t>✅</w:t>
+      </w:r>
+      <w:r>
+        <w:t xml:space="preserve"> Our Story page</w:t>
+      </w:r>
+    </w:p>
+    <w:p>
+      <w:pPr>
+        <w:numPr>
+          <w:ilvl w:val="0"/>
+          <w:numId w:val="1"/>
+        </w:numPr>
+      </w:pPr>
+      <w:r>
+        <w:rPr>
+          <w:rFonts w:ascii="Segoe UI Emoji" w:hAnsi="Segoe UI Emoji" w:cs="Segoe UI Emoji"/>
+        </w:rPr>
+        <w:t>✅</w:t>
+      </w:r>
+      <w:r>
+        <w:t xml:space="preserve"> </w:t>
+      </w:r>
+      <w:proofErr w:type="spellStart"/>
+      <w:r>
+        <w:t>Supabase</w:t>
+      </w:r>
+      <w:proofErr w:type="spellEnd"/>
+      <w:r>
+        <w:t xml:space="preserve"> storage bucket "listings" for photos</w:t>
+      </w:r>
+    </w:p>
+    <w:p>
+      <w:r>
+        <w:rPr>
+          <w:b/>
+          <w:bCs/>
+        </w:rPr>
+        <w:t>What's next:</w:t>
+      </w:r>
+    </w:p>
+    <w:p>
+      <w:pPr>
+        <w:numPr>
+          <w:ilvl w:val="0"/>
+          <w:numId w:val="2"/>
+        </w:numPr>
+      </w:pPr>
+      <w:r>
+        <w:t xml:space="preserve">Test edit/delete and photo upload (latest </w:t>
+      </w:r>
+      <w:proofErr w:type="spellStart"/>
+      <w:r>
+        <w:t>App.jsx</w:t>
+      </w:r>
+      <w:proofErr w:type="spellEnd"/>
+      <w:r>
+        <w:t xml:space="preserve"> needs to be pushed)</w:t>
+      </w:r>
+    </w:p>
+    <w:p>
+      <w:pPr>
+        <w:numPr>
+          <w:ilvl w:val="0"/>
+          <w:numId w:val="2"/>
+        </w:numPr>
+      </w:pPr>
+      <w:r>
+        <w:t>Add search functionality</w:t>
+      </w:r>
+    </w:p>
+    <w:p>
+      <w:pPr>
+        <w:numPr>
+          <w:ilvl w:val="0"/>
+          <w:numId w:val="2"/>
+        </w:numPr>
+      </w:pPr>
+      <w:r>
+        <w:t>Blog section</w:t>
+      </w:r>
+    </w:p>
+    <w:p>
+      <w:pPr>
+        <w:numPr>
+          <w:ilvl w:val="0"/>
+          <w:numId w:val="2"/>
+        </w:numPr>
+      </w:pPr>
+      <w:r>
+        <w:t>Admin panel for you to manage listings</w:t>
+      </w:r>
+    </w:p>
+    <w:p>
+      <w:pPr>
+        <w:numPr>
+          <w:ilvl w:val="0"/>
+          <w:numId w:val="2"/>
+        </w:numPr>
+      </w:pPr>
+      <w:r>
+        <w:t>Connect mamaketplace.com custom domain</w:t>
+      </w:r>
+    </w:p>
+    <w:p>
+      <w:pPr>
+        <w:numPr>
+          <w:ilvl w:val="0"/>
+          <w:numId w:val="2"/>
+        </w:numPr>
+      </w:pPr>
+      <w:r>
+        <w:t>Ad placement sections for local businesses</w:t>
+      </w:r>
+    </w:p>
+    <w:p>
+      <w:r>
+        <w:rPr>
+          <w:b/>
+          <w:bCs/>
+        </w:rPr>
+        <w:t>How to push changes:</w:t>
+      </w:r>
+    </w:p>
+    <w:p>
+      <w:proofErr w:type="spellStart"/>
+      <w:r>
+        <w:t>powershell</w:t>
+      </w:r>
+      <w:proofErr w:type="spellEnd"/>
+    </w:p>
+    <w:p>
+      <w:r>
+        <w:t>cd C:\Users\ksych\OneDrive\Desktop\mamaketplace</w:t>
+      </w:r>
+    </w:p>
+    <w:p>
+      <w:r>
+        <w:t>git add .</w:t>
+      </w:r>
+    </w:p>
+    <w:p>
+      <w:r>
+        <w:t>git commit -m "your message"</w:t>
+      </w:r>
+    </w:p>
+    <w:p>
+      <w:r>
+        <w:t>git push origin master</w:t>
+      </w:r>
+    </w:p>
+    <w:p>
+      <w:r>
+        <w:t xml:space="preserve">Then promote latest deployment to Production on </w:t>
+      </w:r>
+      <w:proofErr w:type="spellStart"/>
+      <w:r>
+        <w:t>Vercel</w:t>
+      </w:r>
+      <w:proofErr w:type="spellEnd"/>
+      <w:r>
+        <w:t>.</w:t>
+      </w:r>
+    </w:p>
     <w:p/>
     <w:sectPr>
       <w:pgSz w:w="12240" w:h="15840"/>
@@ -668,6 +1063,315 @@
     </w:sectPr>
   </w:body>
 </w:document>
+</file>
+
+<file path=word/numbering.xml><?xml version="1.0" encoding="utf-8"?>
+<w:numbering xmlns:wpc="http://schemas.microsoft.com/office/word/2010/wordprocessingCanvas" xmlns:cx="http://schemas.microsoft.com/office/drawing/2014/chartex" xmlns:cx1="http://schemas.microsoft.com/office/drawing/2015/9/8/chartex" xmlns:cx2="http://schemas.microsoft.com/office/drawing/2015/10/21/chartex" xmlns:cx3="http://schemas.microsoft.com/office/drawing/2016/5/9/chartex" xmlns:cx4="http://schemas.microsoft.com/office/drawing/2016/5/10/chartex" xmlns:cx5="http://schemas.microsoft.com/office/drawing/2016/5/11/chartex" xmlns:cx6="http://schemas.microsoft.com/office/drawing/2016/5/12/chartex" xmlns:cx7="http://schemas.microsoft.com/office/drawing/2016/5/13/chartex" xmlns:cx8="http://schemas.microsoft.com/office/drawing/2016/5/14/chartex" xmlns:mc="http://schemas.openxmlformats.org/markup-compatibility/2006" xmlns:aink="http://schemas.microsoft.com/office/drawing/2016/ink" xmlns:am3d="http://schemas.microsoft.com/office/drawing/2017/model3d" xmlns:o="urn:schemas-microsoft-com:office:office" xmlns:oel="http://schemas.microsoft.com/office/2019/extlst" xmlns:r="http://schemas.openxmlformats.org/officeDocument/2006/relationships" xmlns:m="http://schemas.openxmlformats.org/officeDocument/2006/math" xmlns:v="urn:schemas-microsoft-com:vml" xmlns:wp14="http://schemas.microsoft.com/office/word/2010/wordprocessingDrawing" xmlns:wp="http://schemas.openxmlformats.org/drawingml/2006/wordprocessingDrawing" xmlns:w10="urn:schemas-microsoft-com:office:word" xmlns:w="http://schemas.openxmlformats.org/wordprocessingml/2006/main" xmlns:w14="http://schemas.microsoft.com/office/word/2010/wordml" xmlns:w15="http://schemas.microsoft.com/office/word/2012/wordml" xmlns:w16cex="http://schemas.microsoft.com/office/word/2018/wordml/cex" xmlns:w16cid="http://schemas.microsoft.com/office/word/2016/wordml/cid" xmlns:w16="http://schemas.microsoft.com/office/word/2018/wordml" xmlns:w16du="http://schemas.microsoft.com/office/word/2023/wordml/word16du" xmlns:w16sdtdh="http://schemas.microsoft.com/office/word/2020/wordml/sdtdatahash" xmlns:w16sdtfl="http://schemas.microsoft.com/office/word/2024/wordml/sdtformatlock" xmlns:w16se="http://schemas.microsoft.com/office/word/2015/wordml/symex" xmlns:wpg="http://schemas.microsoft.com/office/word/2010/wordprocessingGroup" xmlns:wpi="http://schemas.microsoft.com/office/word/2010/wordprocessingInk" xmlns:wne="http://schemas.microsoft.com/office/word/2006/wordml" xmlns:wps="http://schemas.microsoft.com/office/word/2010/wordprocessingShape" mc:Ignorable="w14 w15 w16se w16cid w16 w16cex w16sdtdh w16sdtfl w16du wp14">
+  <w:abstractNum w:abstractNumId="0" w15:restartNumberingAfterBreak="0">
+    <w:nsid w:val="1CCF646C"/>
+    <w:multiLevelType w:val="multilevel"/>
+    <w:tmpl w:val="ACD640C2"/>
+    <w:lvl w:ilvl="0">
+      <w:start w:val="1"/>
+      <w:numFmt w:val="bullet"/>
+      <w:lvlText w:val=""/>
+      <w:lvlJc w:val="left"/>
+      <w:pPr>
+        <w:tabs>
+          <w:tab w:val="num" w:pos="720"/>
+        </w:tabs>
+        <w:ind w:left="720" w:hanging="360"/>
+      </w:pPr>
+      <w:rPr>
+        <w:rFonts w:ascii="Symbol" w:hAnsi="Symbol" w:hint="default"/>
+        <w:sz w:val="20"/>
+      </w:rPr>
+    </w:lvl>
+    <w:lvl w:ilvl="1" w:tentative="1">
+      <w:start w:val="1"/>
+      <w:numFmt w:val="bullet"/>
+      <w:lvlText w:val="o"/>
+      <w:lvlJc w:val="left"/>
+      <w:pPr>
+        <w:tabs>
+          <w:tab w:val="num" w:pos="1440"/>
+        </w:tabs>
+        <w:ind w:left="1440" w:hanging="360"/>
+      </w:pPr>
+      <w:rPr>
+        <w:rFonts w:ascii="Courier New" w:hAnsi="Courier New" w:hint="default"/>
+        <w:sz w:val="20"/>
+      </w:rPr>
+    </w:lvl>
+    <w:lvl w:ilvl="2" w:tentative="1">
+      <w:start w:val="1"/>
+      <w:numFmt w:val="bullet"/>
+      <w:lvlText w:val=""/>
+      <w:lvlJc w:val="left"/>
+      <w:pPr>
+        <w:tabs>
+          <w:tab w:val="num" w:pos="2160"/>
+        </w:tabs>
+        <w:ind w:left="2160" w:hanging="360"/>
+      </w:pPr>
+      <w:rPr>
+        <w:rFonts w:ascii="Wingdings" w:hAnsi="Wingdings" w:hint="default"/>
+        <w:sz w:val="20"/>
+      </w:rPr>
+    </w:lvl>
+    <w:lvl w:ilvl="3" w:tentative="1">
+      <w:start w:val="1"/>
+      <w:numFmt w:val="bullet"/>
+      <w:lvlText w:val=""/>
+      <w:lvlJc w:val="left"/>
+      <w:pPr>
+        <w:tabs>
+          <w:tab w:val="num" w:pos="2880"/>
+        </w:tabs>
+        <w:ind w:left="2880" w:hanging="360"/>
+      </w:pPr>
+      <w:rPr>
+        <w:rFonts w:ascii="Wingdings" w:hAnsi="Wingdings" w:hint="default"/>
+        <w:sz w:val="20"/>
+      </w:rPr>
+    </w:lvl>
+    <w:lvl w:ilvl="4" w:tentative="1">
+      <w:start w:val="1"/>
+      <w:numFmt w:val="bullet"/>
+      <w:lvlText w:val=""/>
+      <w:lvlJc w:val="left"/>
+      <w:pPr>
+        <w:tabs>
+          <w:tab w:val="num" w:pos="3600"/>
+        </w:tabs>
+        <w:ind w:left="3600" w:hanging="360"/>
+      </w:pPr>
+      <w:rPr>
+        <w:rFonts w:ascii="Wingdings" w:hAnsi="Wingdings" w:hint="default"/>
+        <w:sz w:val="20"/>
+      </w:rPr>
+    </w:lvl>
+    <w:lvl w:ilvl="5" w:tentative="1">
+      <w:start w:val="1"/>
+      <w:numFmt w:val="bullet"/>
+      <w:lvlText w:val=""/>
+      <w:lvlJc w:val="left"/>
+      <w:pPr>
+        <w:tabs>
+          <w:tab w:val="num" w:pos="4320"/>
+        </w:tabs>
+        <w:ind w:left="4320" w:hanging="360"/>
+      </w:pPr>
+      <w:rPr>
+        <w:rFonts w:ascii="Wingdings" w:hAnsi="Wingdings" w:hint="default"/>
+        <w:sz w:val="20"/>
+      </w:rPr>
+    </w:lvl>
+    <w:lvl w:ilvl="6" w:tentative="1">
+      <w:start w:val="1"/>
+      <w:numFmt w:val="bullet"/>
+      <w:lvlText w:val=""/>
+      <w:lvlJc w:val="left"/>
+      <w:pPr>
+        <w:tabs>
+          <w:tab w:val="num" w:pos="5040"/>
+        </w:tabs>
+        <w:ind w:left="5040" w:hanging="360"/>
+      </w:pPr>
+      <w:rPr>
+        <w:rFonts w:ascii="Wingdings" w:hAnsi="Wingdings" w:hint="default"/>
+        <w:sz w:val="20"/>
+      </w:rPr>
+    </w:lvl>
+    <w:lvl w:ilvl="7" w:tentative="1">
+      <w:start w:val="1"/>
+      <w:numFmt w:val="bullet"/>
+      <w:lvlText w:val=""/>
+      <w:lvlJc w:val="left"/>
+      <w:pPr>
+        <w:tabs>
+          <w:tab w:val="num" w:pos="5760"/>
+        </w:tabs>
+        <w:ind w:left="5760" w:hanging="360"/>
+      </w:pPr>
+      <w:rPr>
+        <w:rFonts w:ascii="Wingdings" w:hAnsi="Wingdings" w:hint="default"/>
+        <w:sz w:val="20"/>
+      </w:rPr>
+    </w:lvl>
+    <w:lvl w:ilvl="8" w:tentative="1">
+      <w:start w:val="1"/>
+      <w:numFmt w:val="bullet"/>
+      <w:lvlText w:val=""/>
+      <w:lvlJc w:val="left"/>
+      <w:pPr>
+        <w:tabs>
+          <w:tab w:val="num" w:pos="6480"/>
+        </w:tabs>
+        <w:ind w:left="6480" w:hanging="360"/>
+      </w:pPr>
+      <w:rPr>
+        <w:rFonts w:ascii="Wingdings" w:hAnsi="Wingdings" w:hint="default"/>
+        <w:sz w:val="20"/>
+      </w:rPr>
+    </w:lvl>
+  </w:abstractNum>
+  <w:abstractNum w:abstractNumId="1" w15:restartNumberingAfterBreak="0">
+    <w:nsid w:val="6C9F6CE1"/>
+    <w:multiLevelType w:val="multilevel"/>
+    <w:tmpl w:val="A43E7A44"/>
+    <w:lvl w:ilvl="0">
+      <w:start w:val="1"/>
+      <w:numFmt w:val="bullet"/>
+      <w:lvlText w:val=""/>
+      <w:lvlJc w:val="left"/>
+      <w:pPr>
+        <w:tabs>
+          <w:tab w:val="num" w:pos="720"/>
+        </w:tabs>
+        <w:ind w:left="720" w:hanging="360"/>
+      </w:pPr>
+      <w:rPr>
+        <w:rFonts w:ascii="Symbol" w:hAnsi="Symbol" w:hint="default"/>
+        <w:sz w:val="20"/>
+      </w:rPr>
+    </w:lvl>
+    <w:lvl w:ilvl="1" w:tentative="1">
+      <w:start w:val="1"/>
+      <w:numFmt w:val="bullet"/>
+      <w:lvlText w:val="o"/>
+      <w:lvlJc w:val="left"/>
+      <w:pPr>
+        <w:tabs>
+          <w:tab w:val="num" w:pos="1440"/>
+        </w:tabs>
+        <w:ind w:left="1440" w:hanging="360"/>
+      </w:pPr>
+      <w:rPr>
+        <w:rFonts w:ascii="Courier New" w:hAnsi="Courier New" w:hint="default"/>
+        <w:sz w:val="20"/>
+      </w:rPr>
+    </w:lvl>
+    <w:lvl w:ilvl="2" w:tentative="1">
+      <w:start w:val="1"/>
+      <w:numFmt w:val="bullet"/>
+      <w:lvlText w:val=""/>
+      <w:lvlJc w:val="left"/>
+      <w:pPr>
+        <w:tabs>
+          <w:tab w:val="num" w:pos="2160"/>
+        </w:tabs>
+        <w:ind w:left="2160" w:hanging="360"/>
+      </w:pPr>
+      <w:rPr>
+        <w:rFonts w:ascii="Wingdings" w:hAnsi="Wingdings" w:hint="default"/>
+        <w:sz w:val="20"/>
+      </w:rPr>
+    </w:lvl>
+    <w:lvl w:ilvl="3" w:tentative="1">
+      <w:start w:val="1"/>
+      <w:numFmt w:val="bullet"/>
+      <w:lvlText w:val=""/>
+      <w:lvlJc w:val="left"/>
+      <w:pPr>
+        <w:tabs>
+          <w:tab w:val="num" w:pos="2880"/>
+        </w:tabs>
+        <w:ind w:left="2880" w:hanging="360"/>
+      </w:pPr>
+      <w:rPr>
+        <w:rFonts w:ascii="Wingdings" w:hAnsi="Wingdings" w:hint="default"/>
+        <w:sz w:val="20"/>
+      </w:rPr>
+    </w:lvl>
+    <w:lvl w:ilvl="4" w:tentative="1">
+      <w:start w:val="1"/>
+      <w:numFmt w:val="bullet"/>
+      <w:lvlText w:val=""/>
+      <w:lvlJc w:val="left"/>
+      <w:pPr>
+        <w:tabs>
+          <w:tab w:val="num" w:pos="3600"/>
+        </w:tabs>
+        <w:ind w:left="3600" w:hanging="360"/>
+      </w:pPr>
+      <w:rPr>
+        <w:rFonts w:ascii="Wingdings" w:hAnsi="Wingdings" w:hint="default"/>
+        <w:sz w:val="20"/>
+      </w:rPr>
+    </w:lvl>
+    <w:lvl w:ilvl="5" w:tentative="1">
+      <w:start w:val="1"/>
+      <w:numFmt w:val="bullet"/>
+      <w:lvlText w:val=""/>
+      <w:lvlJc w:val="left"/>
+      <w:pPr>
+        <w:tabs>
+          <w:tab w:val="num" w:pos="4320"/>
+        </w:tabs>
+        <w:ind w:left="4320" w:hanging="360"/>
+      </w:pPr>
+      <w:rPr>
+        <w:rFonts w:ascii="Wingdings" w:hAnsi="Wingdings" w:hint="default"/>
+        <w:sz w:val="20"/>
+      </w:rPr>
+    </w:lvl>
+    <w:lvl w:ilvl="6" w:tentative="1">
+      <w:start w:val="1"/>
+      <w:numFmt w:val="bullet"/>
+      <w:lvlText w:val=""/>
+      <w:lvlJc w:val="left"/>
+      <w:pPr>
+        <w:tabs>
+          <w:tab w:val="num" w:pos="5040"/>
+        </w:tabs>
+        <w:ind w:left="5040" w:hanging="360"/>
+      </w:pPr>
+      <w:rPr>
+        <w:rFonts w:ascii="Wingdings" w:hAnsi="Wingdings" w:hint="default"/>
+        <w:sz w:val="20"/>
+      </w:rPr>
+    </w:lvl>
+    <w:lvl w:ilvl="7" w:tentative="1">
+      <w:start w:val="1"/>
+      <w:numFmt w:val="bullet"/>
+      <w:lvlText w:val=""/>
+      <w:lvlJc w:val="left"/>
+      <w:pPr>
+        <w:tabs>
+          <w:tab w:val="num" w:pos="5760"/>
+        </w:tabs>
+        <w:ind w:left="5760" w:hanging="360"/>
+      </w:pPr>
+      <w:rPr>
+        <w:rFonts w:ascii="Wingdings" w:hAnsi="Wingdings" w:hint="default"/>
+        <w:sz w:val="20"/>
+      </w:rPr>
+    </w:lvl>
+    <w:lvl w:ilvl="8" w:tentative="1">
+      <w:start w:val="1"/>
+      <w:numFmt w:val="bullet"/>
+      <w:lvlText w:val=""/>
+      <w:lvlJc w:val="left"/>
+      <w:pPr>
+        <w:tabs>
+          <w:tab w:val="num" w:pos="6480"/>
+        </w:tabs>
+        <w:ind w:left="6480" w:hanging="360"/>
+      </w:pPr>
+      <w:rPr>
+        <w:rFonts w:ascii="Wingdings" w:hAnsi="Wingdings" w:hint="default"/>
+        <w:sz w:val="20"/>
+      </w:rPr>
+    </w:lvl>
+  </w:abstractNum>
+  <w:num w:numId="1" w16cid:durableId="268586619">
+    <w:abstractNumId w:val="1"/>
+  </w:num>
+  <w:num w:numId="2" w16cid:durableId="1708867750">
+    <w:abstractNumId w:val="0"/>
+  </w:num>
+</w:numbering>
 </file>
 
 <file path=word/styles.xml><?xml version="1.0" encoding="utf-8"?>
@@ -1586,6 +2290,29 @@
       <w:spacing w:val="5"/>
     </w:rPr>
   </w:style>
+  <w:style w:type="character" w:styleId="Hyperlink">
+    <w:name w:val="Hyperlink"/>
+    <w:basedOn w:val="DefaultParagraphFont"/>
+    <w:uiPriority w:val="99"/>
+    <w:unhideWhenUsed/>
+    <w:rsid w:val="004A5641"/>
+    <w:rPr>
+      <w:color w:val="0563C1" w:themeColor="hyperlink"/>
+      <w:u w:val="single"/>
+    </w:rPr>
+  </w:style>
+  <w:style w:type="character" w:styleId="UnresolvedMention">
+    <w:name w:val="Unresolved Mention"/>
+    <w:basedOn w:val="DefaultParagraphFont"/>
+    <w:uiPriority w:val="99"/>
+    <w:semiHidden/>
+    <w:unhideWhenUsed/>
+    <w:rsid w:val="004A5641"/>
+    <w:rPr>
+      <w:color w:val="605E5C"/>
+      <w:shd w:val="clear" w:color="auto" w:fill="E1DFDD"/>
+    </w:rPr>
+  </w:style>
 </w:styles>
 </file>
 

</xml_diff>